<commit_message>
Corregir bug real de tablas ilegibles en la exportacion DOCX (v14)
Usuario reporto con captura de pantalla la tabla de operacionalizacion
ilegible: columnas descuadradas, texto con aspecto de sangria irregular.
Causa raiz confirmada inspeccionando el XML del DOCX generado: Pandoc
reparte el ancho de columnas de una pipe table siempre en partes iguales
sin importar el contenido, y toda celda de tabla heredaba sangria de
primera linea + interlineado doble del estilo de parrafo de cuerpo
(Compact, basado en BodyText) - afectaba a toda tabla del documento, no
solo a la reportada.

Fix verificado con exportaciones reales (Pandoc + LibreOffice, antes/
despues comparado visualmente): nuevo filtro Lua tabla-anchos.lua que
fija anchos de columna proporcionales al contenido real, mas plantilla-apa.docx
parcheada (Compact sin sangria/interlineado doble, bordes de tabla
completos, encabezado centrado de verdad). Probado sin regresion en
tablas de 2, 5 y 6 columnas.
</commit_message>
<xml_diff>
--- a/nucleo/comun/exportacion/plantillas/plantilla-apa.docx
+++ b/nucleo/comun/exportacion/plantillas/plantilla-apa.docx
@@ -520,11 +520,11 @@
   </w:style>
   <w:style w:type="paragraph" w:customStyle="1" w:styleId="Compact">
     <w:name w:val="Compact"/>
-    <w:basedOn w:val="BodyText"/>
-    <w:qFormat/>
-    <w:pPr>
-      <w:spacing w:before="0" w:after="0" w:line="480" w:lineRule="auto"/>
-      <w:ind w:firstLine="720"/>
+    <w:basedOn w:val="Normal"/>
+    <w:qFormat/>
+    <w:pPr>
+      <w:spacing w:before="40" w:after="40" w:line="240" w:lineRule="auto"/>
+      <w:ind w:firstLine="0"/>
     </w:pPr>
   </w:style>
   <w:style w:type="paragraph" w:styleId="Title">
@@ -1028,6 +1028,14 @@
     <w:qFormat/>
     <w:tblPr>
       <w:tblInd w:w="0" w:type="dxa"/>
+      <w:tblBorders>
+        <w:top w:val="single" w:sz="4" w:space="0" w:color="auto"/>
+        <w:bottom w:val="single" w:sz="4" w:space="0" w:color="auto"/>
+        <w:insideH w:val="none"/>
+        <w:insideV w:val="none"/>
+        <w:left w:val="none"/>
+        <w:right w:val="none"/>
+      </w:tblBorders>
       <w:tblCellMar>
         <w:top w:w="0" w:type="dxa"/>
         <w:left w:w="108" w:type="dxa"/>
@@ -1036,6 +1044,9 @@
       </w:tblCellMar>
     </w:tblPr>
     <w:tblStylePr w:type="firstRow">
+      <w:pPr>
+        <w:jc w:val="center"/>
+      </w:pPr>
       <w:tcPr>
         <w:tcBorders>
           <w:bottom w:val="single"/>

</xml_diff>